<commit_message>
Docs: alle testpersoner både sælger og køber
Co-Authored-By: Claude Opus 5.5 <noreply@anthropic.com>
</commit_message>
<xml_diff>
--- a/docs/BETA-TJEKLISTE.docx
+++ b/docs/BETA-TJEKLISTE.docx
@@ -16,6 +16,18 @@
     <w:p>
       <w:r>
         <w:t>Navn: ______________________  Telefon: ☐ iPhone ☐ Android ☐ Computer  Browser: __________</w:t>
+      </w:r>
+    </w:p>
+    <w:p>
+      <w:r/>
+      <w:r>
+        <w:rPr>
+          <w:b/>
+        </w:rPr>
+        <w:t>Du skal både sælge og købe.</w:t>
+      </w:r>
+      <w:r>
+        <w:t xml:space="preserve"> Sæt mindst 2 varer til salg, og byd på mindst 3 andre testpersoners auktioner, så du prøver handlen fra begge sider.</w:t>
       </w:r>
     </w:p>
     <w:p>
@@ -54,7 +66,7 @@
         <w:rPr>
           <w:color w:val="1E5E4A"/>
         </w:rPr>
-        <w:t>A. Kom i gang (alle)</w:t>
+        <w:t>A. Kom i gang</w:t>
       </w:r>
     </w:p>
     <w:tbl>
@@ -521,7 +533,7 @@
         <w:rPr>
           <w:color w:val="1E5E4A"/>
         </w:rPr>
-        <w:t>B. Kig rundt (alle)</w:t>
+        <w:t>B. Kig rundt</w:t>
       </w:r>
     </w:p>
     <w:tbl>
@@ -896,7 +908,7 @@
         <w:rPr>
           <w:color w:val="1E5E4A"/>
         </w:rPr>
-        <w:t>C. Sælg en vare (sælgere)</w:t>
+        <w:t>C. Sælg en vare</w:t>
       </w:r>
     </w:p>
     <w:tbl>
@@ -1225,7 +1237,7 @@
         <w:rPr>
           <w:color w:val="1E5E4A"/>
         </w:rPr>
-        <w:t>D. Byd og vind (købere)</w:t>
+        <w:t>D. Byd og vind</w:t>
       </w:r>
     </w:p>
     <w:tbl>
@@ -1508,7 +1520,7 @@
         <w:rPr>
           <w:color w:val="1E5E4A"/>
         </w:rPr>
-        <w:t>E. Betal (købere)</w:t>
+        <w:t>E. Betal</w:t>
       </w:r>
     </w:p>
     <w:tbl>
@@ -1945,7 +1957,7 @@
           <w:p>
             <w:r/>
             <w:r>
-              <w:t>(Sælger) Åbn handlen, og hent fragtlabel / labelfri kode</w:t>
+              <w:t>(Som sælger) Åbn handlen, og hent fragtlabel / labelfri kode</w:t>
             </w:r>
           </w:p>
         </w:tc>
@@ -1991,7 +2003,7 @@
           <w:p>
             <w:r/>
             <w:r>
-              <w:t>(Sælger) Tryk "Marker som sendt", og tag billeder af pakken</w:t>
+              <w:t>(Som sælger) Tryk "Marker som sendt", og tag billeder af pakken</w:t>
             </w:r>
           </w:p>
         </w:tc>
@@ -2037,7 +2049,7 @@
           <w:p>
             <w:r/>
             <w:r>
-              <w:t>(Køber) Når pakken er "leveret" (BidHamr rykker den i testen), tryk "Jeg har modtaget pakken"</w:t>
+              <w:t>(Som køber) Når pakken er "leveret" (BidHamr rykker den i testen), tryk "Jeg har modtaget pakken"</w:t>
             </w:r>
           </w:p>
         </w:tc>
@@ -2083,7 +2095,7 @@
           <w:p>
             <w:r/>
             <w:r>
-              <w:t>(Køber) Godkend varen, og giv stjerner</w:t>
+              <w:t>(Som køber) Godkend varen, og giv stjerner</w:t>
             </w:r>
           </w:p>
         </w:tc>
@@ -2129,7 +2141,7 @@
           <w:p>
             <w:r/>
             <w:r>
-              <w:t>(Sælger) Se, at pengene er på vej</w:t>
+              <w:t>(Som sælger) Se, at pengene er på vej</w:t>
             </w:r>
           </w:p>
         </w:tc>
@@ -2320,7 +2332,7 @@
           <w:p>
             <w:r/>
             <w:r>
-              <w:t>(Køber) Opret en sag på en handel: "Varen er ikke som beskrevet", med billeder</w:t>
+              <w:t>(Som køber) Opret en sag på en handel: "Varen er ikke som beskrevet", med billeder</w:t>
             </w:r>
           </w:p>
         </w:tc>
@@ -2366,7 +2378,7 @@
           <w:p>
             <w:r/>
             <w:r>
-              <w:t>(Sælger) Svar på sagen</w:t>
+              <w:t>(Som sælger) Svar på sagen</w:t>
             </w:r>
           </w:p>
         </w:tc>
@@ -2541,7 +2553,7 @@
         <w:rPr>
           <w:color w:val="1E5E4A"/>
         </w:rPr>
-        <w:t>H. Min konto (alle)</w:t>
+        <w:t>H. Min konto</w:t>
       </w:r>
     </w:p>
     <w:tbl>

</xml_diff>